<commit_message>
Made product work locally on Intellij. MongoDB, ZooKeeper and Kafka run on Docker Desktop containers.
</commit_message>
<xml_diff>
--- a/Docs/How_to_Build_Projects/API_Users.docx
+++ b/Docs/How_to_Build_Projects/API_Users.docx
@@ -28103,6 +28103,56 @@
           <w:szCs w:val="21"/>
           <w14:ligatures w14:val="none"/>
         </w:rPr>
+        <w:t>Start a Post</w:t>
+      </w:r>
+      <w:r>
+        <w:rPr>
+          <w:rFonts w:ascii="Arial" w:eastAsia="Times New Roman" w:hAnsi="Arial" w:cs="Arial"/>
+          <w:color w:val="000000"/>
+          <w:kern w:val="0"/>
+          <w:sz w:val="21"/>
+          <w:szCs w:val="21"/>
+          <w14:ligatures w14:val="none"/>
+        </w:rPr>
+        <w:t>g</w:t>
+      </w:r>
+      <w:r>
+        <w:rPr>
+          <w:rFonts w:ascii="Arial" w:eastAsia="Times New Roman" w:hAnsi="Arial" w:cs="Arial"/>
+          <w:color w:val="000000"/>
+          <w:kern w:val="0"/>
+          <w:sz w:val="21"/>
+          <w:szCs w:val="21"/>
+          <w14:ligatures w14:val="none"/>
+        </w:rPr>
+        <w:t>res container at port 5432:5432 in the docker desktop.</w:t>
+      </w:r>
+    </w:p>
+    <w:p>
+      <w:pPr>
+        <w:numPr>
+          <w:ilvl w:val="0"/>
+          <w:numId w:val="74"/>
+        </w:numPr>
+        <w:spacing w:after="0" w:afterAutospacing="1" w:line="240" w:lineRule="auto"/>
+        <w:rPr>
+          <w:rFonts w:ascii="Arial" w:eastAsia="Times New Roman" w:hAnsi="Arial" w:cs="Arial"/>
+          <w:color w:val="000000"/>
+          <w:kern w:val="0"/>
+          <w:sz w:val="21"/>
+          <w:szCs w:val="21"/>
+          <w14:ligatures w14:val="none"/>
+        </w:rPr>
+      </w:pPr>
+      <w:r>
+        <w:rPr>
+          <w:rFonts w:ascii="Arial" w:eastAsia="Times New Roman" w:hAnsi="Arial" w:cs="Arial"/>
+          <w:color w:val="000000"/>
+          <w:kern w:val="0"/>
+          <w:sz w:val="21"/>
+          <w:szCs w:val="21"/>
+          <w14:ligatures w14:val="none"/>
+        </w:rPr>
         <w:t>Run your Spring Boot application (</w:t>
       </w:r>
       <w:r>
@@ -28153,6 +28203,7 @@
           <w:szCs w:val="21"/>
           <w14:ligatures w14:val="none"/>
         </w:rPr>
+        <w:lastRenderedPageBreak/>
         <w:t xml:space="preserve">Access the OpenAPI JSON at </w:t>
       </w:r>
       <w:r>
@@ -28203,7 +28254,6 @@
           <w:szCs w:val="21"/>
           <w14:ligatures w14:val="none"/>
         </w:rPr>
-        <w:lastRenderedPageBreak/>
         <w:t xml:space="preserve">Access Swagger UI at </w:t>
       </w:r>
       <w:r>
@@ -29963,6 +30013,7 @@
           <w:szCs w:val="18"/>
           <w14:ligatures w14:val="none"/>
         </w:rPr>
+        <w:lastRenderedPageBreak/>
         <w:t>    ]</w:t>
       </w:r>
     </w:p>
@@ -29997,7 +30048,6 @@
         <w:pStyle w:val="Heading2"/>
       </w:pPr>
       <w:r>
-        <w:lastRenderedPageBreak/>
         <w:t>Login:</w:t>
       </w:r>
     </w:p>
@@ -30971,6 +31021,7 @@
         <w:pStyle w:val="Heading2"/>
       </w:pPr>
       <w:r>
+        <w:lastRenderedPageBreak/>
         <w:t>Password Reset Request:</w:t>
       </w:r>
     </w:p>
@@ -31009,7 +31060,6 @@
           <w:sz w:val="22"/>
           <w:szCs w:val="22"/>
         </w:rPr>
-        <w:lastRenderedPageBreak/>
         <w:t>Endpoint: POST /api/auth/password/reset?email=testuser@example.com</w:t>
       </w:r>
     </w:p>

</xml_diff>